<commit_message>
Test 3 full question paper
</commit_message>
<xml_diff>
--- a/Assessments/Test_3/QuestionPaper3.docx
+++ b/Assessments/Test_3/QuestionPaper3.docx
@@ -908,18 +908,24 @@
     <w:p>
       <w:pPr>
         <w:rPr>
-          <w:lang w:val="en-US"/>
-        </w:rPr>
-      </w:pPr>
-    </w:p>
-    <w:p>
-      <w:pPr>
-        <w:rPr>
-          <w:lang w:val="en-US"/>
-        </w:rPr>
-      </w:pPr>
-      <w:r>
-        <w:rPr>
+          <w:b/>
+          <w:bCs/>
+          <w:lang w:val="en-US"/>
+        </w:rPr>
+      </w:pPr>
+    </w:p>
+    <w:p>
+      <w:pPr>
+        <w:rPr>
+          <w:b/>
+          <w:bCs/>
+          <w:lang w:val="en-US"/>
+        </w:rPr>
+      </w:pPr>
+      <w:r>
+        <w:rPr>
+          <w:b/>
+          <w:bCs/>
           <w:lang w:val="en-US"/>
         </w:rPr>
         <w:t>PART – 3</w:t>
@@ -928,11 +934,15 @@
     <w:p>
       <w:pPr>
         <w:rPr>
-          <w:lang w:val="en-US"/>
-        </w:rPr>
-      </w:pPr>
-      <w:r>
-        <w:rPr>
+          <w:b/>
+          <w:bCs/>
+          <w:lang w:val="en-US"/>
+        </w:rPr>
+      </w:pPr>
+      <w:r>
+        <w:rPr>
+          <w:b/>
+          <w:bCs/>
           <w:lang w:val="en-US"/>
         </w:rPr>
         <w:t>Subject – Linux Operating System concepts ( Practical Test )</w:t>
@@ -1127,11 +1137,15 @@
     <w:p>
       <w:pPr>
         <w:rPr>
-          <w:lang w:val="en-US"/>
-        </w:rPr>
-      </w:pPr>
-      <w:r>
-        <w:rPr>
+          <w:b/>
+          <w:bCs/>
+          <w:lang w:val="en-US"/>
+        </w:rPr>
+      </w:pPr>
+      <w:r>
+        <w:rPr>
+          <w:b/>
+          <w:bCs/>
           <w:lang w:val="en-US"/>
         </w:rPr>
         <w:t>Part – D</w:t>
@@ -1140,11 +1154,15 @@
     <w:p>
       <w:pPr>
         <w:rPr>
-          <w:lang w:val="en-US"/>
-        </w:rPr>
-      </w:pPr>
-      <w:r>
-        <w:rPr>
+          <w:b/>
+          <w:bCs/>
+          <w:lang w:val="en-US"/>
+        </w:rPr>
+      </w:pPr>
+      <w:r>
+        <w:rPr>
+          <w:b/>
+          <w:bCs/>
           <w:lang w:val="en-US"/>
         </w:rPr>
         <w:t>Subject – SDLC, Agile Software Model and SCRUM ( VIVA Questions )</w:t>

</xml_diff>